<commit_message>
0,21,98 - Avery template
renamed and copied for future divider tabs
</commit_message>
<xml_diff>
--- a/0 TOC.docx
+++ b/0 TOC.docx
@@ -51,31 +51,6 @@
           </w:tcPr>
           <w:p>
             <w:r>
-              <w:t>0</w:t>
-            </w:r>
-          </w:p>
-        </w:tc>
-        <w:tc>
-          <w:tcPr>
-            <w:tcW w:w="4590" w:type="dxa"/>
-          </w:tcPr>
-          <w:p>
-            <w:r>
-              <w:t>Introduction.docx</w:t>
-            </w:r>
-          </w:p>
-        </w:tc>
-      </w:tr>
-      <w:tr>
-        <w:trPr>
-          <w:trHeight w:val="432"/>
-        </w:trPr>
-        <w:tc>
-          <w:tcPr>
-            <w:tcW w:w="625" w:type="dxa"/>
-          </w:tcPr>
-          <w:p>
-            <w:r>
               <w:t>1</w:t>
             </w:r>
           </w:p>
@@ -86,7 +61,7 @@
           </w:tcPr>
           <w:p>
             <w:r>
-              <w:t>Lead Like the Savior.docx</w:t>
+              <w:t>Lead Like the Savior</w:t>
             </w:r>
           </w:p>
         </w:tc>
@@ -111,7 +86,7 @@
           </w:tcPr>
           <w:p>
             <w:r>
-              <w:t>Storehouse Managers.docx</w:t>
+              <w:t>Storehouse Managers</w:t>
             </w:r>
           </w:p>
         </w:tc>
@@ -136,7 +111,7 @@
           </w:tcPr>
           <w:p>
             <w:r>
-              <w:t>Bishops Orders - How to Fill.docx</w:t>
+              <w:t>Bishops Orders - How to Fill</w:t>
             </w:r>
           </w:p>
         </w:tc>
@@ -161,7 +136,7 @@
           </w:tcPr>
           <w:p>
             <w:r>
-              <w:t>Opening Procedures.docx</w:t>
+              <w:t>Opening Procedures</w:t>
             </w:r>
           </w:p>
         </w:tc>
@@ -186,7 +161,7 @@
           </w:tcPr>
           <w:p>
             <w:r>
-              <w:t>Closing Procedures.docx</w:t>
+              <w:t>Closing Procedures</w:t>
             </w:r>
           </w:p>
         </w:tc>
@@ -211,7 +186,7 @@
           </w:tcPr>
           <w:p>
             <w:r>
-              <w:t>Help.docx</w:t>
+              <w:t>Help</w:t>
             </w:r>
           </w:p>
         </w:tc>
@@ -236,7 +211,7 @@
           </w:tcPr>
           <w:p>
             <w:r>
-              <w:t>Handling Paperwork.docx</w:t>
+              <w:t>Handling Paperwork</w:t>
             </w:r>
           </w:p>
         </w:tc>
@@ -261,7 +236,7 @@
           </w:tcPr>
           <w:p>
             <w:r>
-              <w:t>End of Month Report.docx</w:t>
+              <w:t>End of Month Report</w:t>
             </w:r>
           </w:p>
         </w:tc>
@@ -286,7 +261,7 @@
           </w:tcPr>
           <w:p>
             <w:r>
-              <w:t>Bills of Lading and Invoices.docx</w:t>
+              <w:t>Bills of Lading and Invoices</w:t>
             </w:r>
           </w:p>
         </w:tc>
@@ -336,7 +311,7 @@
           </w:tcPr>
           <w:p>
             <w:r>
-              <w:t>Spoiled and Damaged Items.docx</w:t>
+              <w:t>Spoiled and Damaged Items</w:t>
             </w:r>
           </w:p>
         </w:tc>
@@ -361,7 +336,7 @@
           </w:tcPr>
           <w:p>
             <w:r>
-              <w:t>Storehouse Use Log.docx</w:t>
+              <w:t>Storehouse Use Log</w:t>
             </w:r>
           </w:p>
         </w:tc>
@@ -386,7 +361,7 @@
           </w:tcPr>
           <w:p>
             <w:r>
-              <w:t>Surplus.docx</w:t>
+              <w:t>Surplus</w:t>
             </w:r>
           </w:p>
         </w:tc>
@@ -411,9 +386,6 @@
           </w:tcPr>
           <w:p>
             <w:r>
-              <w:rPr>
-                <w:color w:val="EE0000"/>
-              </w:rPr>
               <w:t xml:space="preserve">Purchasing </w:t>
             </w:r>
             <w:r>
@@ -442,7 +414,7 @@
           </w:tcPr>
           <w:p>
             <w:r>
-              <w:t>Quarterly Meetings.docx</w:t>
+              <w:t>Quarterly Meetings</w:t>
             </w:r>
           </w:p>
         </w:tc>
@@ -467,7 +439,7 @@
           </w:tcPr>
           <w:p>
             <w:r>
-              <w:t>Onboarding and Training.docx</w:t>
+              <w:t>Onboarding and Training</w:t>
             </w:r>
           </w:p>
         </w:tc>
@@ -492,7 +464,7 @@
           </w:tcPr>
           <w:p>
             <w:r>
-              <w:t>Safety.docx</w:t>
+              <w:t>Safety</w:t>
             </w:r>
           </w:p>
         </w:tc>
@@ -517,7 +489,7 @@
           </w:tcPr>
           <w:p>
             <w:r>
-              <w:t>Emergencies.docx</w:t>
+              <w:t>Emergencies</w:t>
             </w:r>
           </w:p>
         </w:tc>
@@ -542,7 +514,7 @@
           </w:tcPr>
           <w:p>
             <w:r>
-              <w:t>Cleaning and Sanitation.docx</w:t>
+              <w:t>Cleaning and Sanitation</w:t>
             </w:r>
           </w:p>
         </w:tc>
@@ -592,7 +564,7 @@
           </w:tcPr>
           <w:p>
             <w:r>
-              <w:t>Inventory.docx</w:t>
+              <w:t>Weekly and Monthly Stock Orders</w:t>
             </w:r>
           </w:p>
         </w:tc>
@@ -617,7 +589,7 @@
           </w:tcPr>
           <w:p>
             <w:r>
-              <w:t>Storehouse Deliveries.docx</w:t>
+              <w:t>Storehouse Deliveries</w:t>
             </w:r>
           </w:p>
         </w:tc>
@@ -642,9 +614,6 @@
           </w:tcPr>
           <w:p>
             <w:r>
-              <w:rPr>
-                <w:color w:val="EE0000"/>
-              </w:rPr>
               <w:t>Phone</w:t>
             </w:r>
             <w:r>
@@ -673,7 +642,7 @@
           </w:tcPr>
           <w:p>
             <w:r>
-              <w:t>Youth or Adult Stocking Event.docx</w:t>
+              <w:t>Youth or Adult Stocking Event</w:t>
             </w:r>
           </w:p>
         </w:tc>
@@ -698,7 +667,7 @@
           </w:tcPr>
           <w:p>
             <w:r>
-              <w:t>MKS Birthday Celebrations.docx</w:t>
+              <w:t>MKS Birthday Celebrations</w:t>
             </w:r>
           </w:p>
         </w:tc>
@@ -723,7 +692,7 @@
           </w:tcPr>
           <w:p>
             <w:r>
-              <w:t>Christmas.docx</w:t>
+              <w:t>Christmas</w:t>
             </w:r>
           </w:p>
         </w:tc>
@@ -748,7 +717,7 @@
           </w:tcPr>
           <w:p>
             <w:r>
-              <w:t>Year End Boxes.docx</w:t>
+              <w:t>Year End Boxes</w:t>
             </w:r>
           </w:p>
         </w:tc>
@@ -827,7 +796,21 @@
         <w:i/>
         <w:iCs/>
       </w:rPr>
-      <w:t>7-24-2026</w:t>
+      <w:t>7-2</w:t>
+    </w:r>
+    <w:r>
+      <w:rPr>
+        <w:i/>
+        <w:iCs/>
+      </w:rPr>
+      <w:t>5</w:t>
+    </w:r>
+    <w:r>
+      <w:rPr>
+        <w:i/>
+        <w:iCs/>
+      </w:rPr>
+      <w:t>-2026</w:t>
     </w:r>
   </w:p>
   <w:p>

</xml_diff>